<commit_message>
Added teh QABite requirements
</commit_message>
<xml_diff>
--- a/Labs/Lab 1 - UML Modelling New.docx
+++ b/Labs/Lab 1 - UML Modelling New.docx
@@ -185,7 +185,10 @@
     </w:p>
     <w:p>
       <w:r>
-        <w:t xml:space="preserve">You will use the </w:t>
+        <w:t xml:space="preserve">You have decided to create a </w:t>
+      </w:r>
+      <w:r>
+        <w:t xml:space="preserve">startup company called </w:t>
       </w:r>
       <w:proofErr w:type="spellStart"/>
       <w:r>
@@ -204,8 +207,43 @@
         <w:t xml:space="preserve"> </w:t>
       </w:r>
       <w:r>
-        <w:t>Food</w:t>
-      </w:r>
+        <w:t xml:space="preserve"> is planning to launch a new food delivery platform to compete with services like Uber Eats and Deliveroo.</w:t>
+      </w:r>
+    </w:p>
+    <w:p>
+      <w:r>
+        <w:t>The goal is to create a system that connects customers, restaurants, and delivery drivers through a single platform that manages ordering, preparation, and delivery of food.</w:t>
+      </w:r>
+    </w:p>
+    <w:p>
+      <w:r>
+        <w:t>The founders have come to your development team with a rough idea of how the system should work, but no formal specification exists yet.</w:t>
+      </w:r>
+    </w:p>
+    <w:p>
+      <w:r>
+        <w:t>Your task is to analyse the scenario and design the system from scratch.</w:t>
+      </w:r>
+    </w:p>
+    <w:p/>
+    <w:p>
+      <w:pPr>
+        <w:pStyle w:val="Heading3"/>
+      </w:pPr>
+      <w:r>
+        <w:t>Scenario Description</w:t>
+      </w:r>
+    </w:p>
+    <w:p>
+      <w:proofErr w:type="spellStart"/>
+      <w:r>
+        <w:rPr>
+          <w:b/>
+          <w:bCs/>
+        </w:rPr>
+        <w:t>QABite</w:t>
+      </w:r>
+      <w:proofErr w:type="spellEnd"/>
       <w:r>
         <w:rPr>
           <w:b/>
@@ -214,15 +252,385 @@
         <w:t xml:space="preserve"> </w:t>
       </w:r>
       <w:r>
-        <w:t>Delivery System scenario</w:t>
-      </w:r>
-      <w:r>
-        <w:t xml:space="preserve"> provided earlier.</w:t>
-      </w:r>
-    </w:p>
-    <w:p>
-      <w:r>
-        <w:t>Do not invent a completely new system. Work from the given context and extend it where needed with reasonable assumptions.</w:t>
+        <w:t xml:space="preserve"> allows customers to browse nearby restaurants, view menus, and place orders for delivery.</w:t>
+      </w:r>
+    </w:p>
+    <w:p/>
+    <w:p>
+      <w:pPr>
+        <w:rPr>
+          <w:b/>
+          <w:bCs/>
+        </w:rPr>
+      </w:pPr>
+      <w:r>
+        <w:rPr>
+          <w:b/>
+          <w:bCs/>
+        </w:rPr>
+        <w:t>When a customer places an order:</w:t>
+      </w:r>
+    </w:p>
+    <w:p>
+      <w:pPr>
+        <w:numPr>
+          <w:ilvl w:val="0"/>
+          <w:numId w:val="17"/>
+        </w:numPr>
+        <w:spacing w:line="276" w:lineRule="auto"/>
+      </w:pPr>
+      <w:r>
+        <w:t>The selected restaurant receives the order and decides whether to accept or reject it</w:t>
+      </w:r>
+    </w:p>
+    <w:p>
+      <w:pPr>
+        <w:numPr>
+          <w:ilvl w:val="0"/>
+          <w:numId w:val="17"/>
+        </w:numPr>
+        <w:spacing w:line="276" w:lineRule="auto"/>
+      </w:pPr>
+      <w:r>
+        <w:t>If accepted, the restaurant prepares the food</w:t>
+      </w:r>
+    </w:p>
+    <w:p>
+      <w:pPr>
+        <w:numPr>
+          <w:ilvl w:val="0"/>
+          <w:numId w:val="17"/>
+        </w:numPr>
+        <w:spacing w:line="276" w:lineRule="auto"/>
+      </w:pPr>
+      <w:r>
+        <w:t>Once ready, a delivery driver is assigned to collect and deliver the order</w:t>
+      </w:r>
+    </w:p>
+    <w:p>
+      <w:pPr>
+        <w:rPr>
+          <w:b/>
+          <w:bCs/>
+        </w:rPr>
+      </w:pPr>
+    </w:p>
+    <w:p>
+      <w:pPr>
+        <w:rPr>
+          <w:b/>
+          <w:bCs/>
+        </w:rPr>
+      </w:pPr>
+      <w:r>
+        <w:rPr>
+          <w:b/>
+          <w:bCs/>
+        </w:rPr>
+        <w:t>Customers want to:</w:t>
+      </w:r>
+    </w:p>
+    <w:p>
+      <w:pPr>
+        <w:numPr>
+          <w:ilvl w:val="0"/>
+          <w:numId w:val="18"/>
+        </w:numPr>
+        <w:spacing w:line="276" w:lineRule="auto"/>
+      </w:pPr>
+      <w:r>
+        <w:t>Track their order status in real time</w:t>
+      </w:r>
+    </w:p>
+    <w:p>
+      <w:pPr>
+        <w:numPr>
+          <w:ilvl w:val="0"/>
+          <w:numId w:val="18"/>
+        </w:numPr>
+        <w:spacing w:line="276" w:lineRule="auto"/>
+      </w:pPr>
+      <w:r>
+        <w:t>See estimated delivery times</w:t>
+      </w:r>
+    </w:p>
+    <w:p>
+      <w:pPr>
+        <w:numPr>
+          <w:ilvl w:val="0"/>
+          <w:numId w:val="18"/>
+        </w:numPr>
+        <w:spacing w:line="276" w:lineRule="auto"/>
+      </w:pPr>
+      <w:r>
+        <w:t>Rate their experience after delivery</w:t>
+      </w:r>
+    </w:p>
+    <w:p/>
+    <w:p>
+      <w:pPr>
+        <w:keepNext/>
+        <w:keepLines/>
+        <w:rPr>
+          <w:b/>
+          <w:bCs/>
+        </w:rPr>
+      </w:pPr>
+      <w:r>
+        <w:rPr>
+          <w:b/>
+          <w:bCs/>
+        </w:rPr>
+        <w:lastRenderedPageBreak/>
+        <w:t>Restaurants want to:</w:t>
+      </w:r>
+    </w:p>
+    <w:p>
+      <w:pPr>
+        <w:keepNext/>
+        <w:keepLines/>
+        <w:numPr>
+          <w:ilvl w:val="0"/>
+          <w:numId w:val="19"/>
+        </w:numPr>
+        <w:spacing w:line="276" w:lineRule="auto"/>
+      </w:pPr>
+      <w:r>
+        <w:t>Manage their menus and update item availability</w:t>
+      </w:r>
+    </w:p>
+    <w:p>
+      <w:pPr>
+        <w:keepNext/>
+        <w:keepLines/>
+        <w:numPr>
+          <w:ilvl w:val="0"/>
+          <w:numId w:val="19"/>
+        </w:numPr>
+        <w:spacing w:line="276" w:lineRule="auto"/>
+      </w:pPr>
+      <w:r>
+        <w:t>Control whether they are open or closed</w:t>
+      </w:r>
+    </w:p>
+    <w:p>
+      <w:pPr>
+        <w:numPr>
+          <w:ilvl w:val="0"/>
+          <w:numId w:val="19"/>
+        </w:numPr>
+        <w:spacing w:line="276" w:lineRule="auto"/>
+      </w:pPr>
+      <w:r>
+        <w:t>Handle incoming orders efficiently</w:t>
+      </w:r>
+    </w:p>
+    <w:p>
+      <w:pPr>
+        <w:spacing w:line="276" w:lineRule="auto"/>
+      </w:pPr>
+    </w:p>
+    <w:p>
+      <w:pPr>
+        <w:rPr>
+          <w:b/>
+          <w:bCs/>
+        </w:rPr>
+      </w:pPr>
+      <w:r>
+        <w:rPr>
+          <w:b/>
+          <w:bCs/>
+        </w:rPr>
+        <w:t>Delivery drivers want to:</w:t>
+      </w:r>
+    </w:p>
+    <w:p>
+      <w:pPr>
+        <w:numPr>
+          <w:ilvl w:val="0"/>
+          <w:numId w:val="20"/>
+        </w:numPr>
+        <w:spacing w:line="276" w:lineRule="auto"/>
+      </w:pPr>
+      <w:r>
+        <w:t>Choose when they are available to work</w:t>
+      </w:r>
+    </w:p>
+    <w:p>
+      <w:pPr>
+        <w:numPr>
+          <w:ilvl w:val="0"/>
+          <w:numId w:val="20"/>
+        </w:numPr>
+        <w:spacing w:line="276" w:lineRule="auto"/>
+      </w:pPr>
+      <w:r>
+        <w:t>Accept or decline delivery requests</w:t>
+      </w:r>
+    </w:p>
+    <w:p>
+      <w:pPr>
+        <w:numPr>
+          <w:ilvl w:val="0"/>
+          <w:numId w:val="20"/>
+        </w:numPr>
+        <w:spacing w:line="276" w:lineRule="auto"/>
+      </w:pPr>
+      <w:r>
+        <w:t>Navigate to restaurants and customers</w:t>
+      </w:r>
+    </w:p>
+    <w:p>
+      <w:pPr>
+        <w:numPr>
+          <w:ilvl w:val="0"/>
+          <w:numId w:val="20"/>
+        </w:numPr>
+        <w:spacing w:line="276" w:lineRule="auto"/>
+      </w:pPr>
+      <w:r>
+        <w:t>Update delivery status throughout the process</w:t>
+      </w:r>
+    </w:p>
+    <w:p>
+      <w:pPr>
+        <w:spacing w:line="276" w:lineRule="auto"/>
+      </w:pPr>
+    </w:p>
+    <w:p>
+      <w:r>
+        <w:t>The company also requires an administrative function to monitor the platform, manage users, and review system activity.</w:t>
+      </w:r>
+    </w:p>
+    <w:p/>
+    <w:p>
+      <w:pPr>
+        <w:pStyle w:val="Heading2"/>
+      </w:pPr>
+      <w:r>
+        <w:t>Your Task</w:t>
+      </w:r>
+    </w:p>
+    <w:p>
+      <w:pPr>
+        <w:keepNext/>
+        <w:keepLines/>
+      </w:pPr>
+      <w:r>
+        <w:t>You are required to analyse the scenario and produce a system design. You have not been given a predefined structure, so you must determine the key components yourself.</w:t>
+      </w:r>
+      <w:r>
+        <w:br/>
+      </w:r>
+    </w:p>
+    <w:p>
+      <w:pPr>
+        <w:keepNext/>
+        <w:keepLines/>
+        <w:spacing w:line="360" w:lineRule="auto"/>
+        <w:rPr>
+          <w:b/>
+          <w:bCs/>
+        </w:rPr>
+      </w:pPr>
+      <w:r>
+        <w:rPr>
+          <w:b/>
+          <w:bCs/>
+        </w:rPr>
+        <w:t>As part of your analysis, you should identify:</w:t>
+      </w:r>
+    </w:p>
+    <w:p>
+      <w:pPr>
+        <w:keepNext/>
+        <w:keepLines/>
+        <w:numPr>
+          <w:ilvl w:val="0"/>
+          <w:numId w:val="21"/>
+        </w:numPr>
+        <w:spacing w:line="360" w:lineRule="auto"/>
+      </w:pPr>
+      <w:r>
+        <w:t>The different types of users (actors) interacting with the system</w:t>
+      </w:r>
+    </w:p>
+    <w:p>
+      <w:pPr>
+        <w:keepNext/>
+        <w:keepLines/>
+        <w:numPr>
+          <w:ilvl w:val="0"/>
+          <w:numId w:val="21"/>
+        </w:numPr>
+        <w:spacing w:line="360" w:lineRule="auto"/>
+      </w:pPr>
+      <w:r>
+        <w:t>The main use cases that describe how the system will be used</w:t>
+      </w:r>
+    </w:p>
+    <w:p>
+      <w:pPr>
+        <w:keepNext/>
+        <w:keepLines/>
+        <w:numPr>
+          <w:ilvl w:val="0"/>
+          <w:numId w:val="21"/>
+        </w:numPr>
+        <w:spacing w:line="360" w:lineRule="auto"/>
+      </w:pPr>
+      <w:r>
+        <w:t xml:space="preserve">The key </w:t>
+      </w:r>
+      <w:r>
+        <w:t>use cases</w:t>
+      </w:r>
+      <w:r>
+        <w:t xml:space="preserve"> required to store and manage data</w:t>
+      </w:r>
+    </w:p>
+    <w:p>
+      <w:pPr>
+        <w:keepNext/>
+        <w:keepLines/>
+        <w:numPr>
+          <w:ilvl w:val="0"/>
+          <w:numId w:val="21"/>
+        </w:numPr>
+        <w:spacing w:line="360" w:lineRule="auto"/>
+      </w:pPr>
+      <w:r>
+        <w:t xml:space="preserve">The relationships between </w:t>
+      </w:r>
+      <w:r>
+        <w:t>actors and the use cases</w:t>
+      </w:r>
+    </w:p>
+    <w:p>
+      <w:pPr>
+        <w:keepNext/>
+        <w:keepLines/>
+        <w:numPr>
+          <w:ilvl w:val="0"/>
+          <w:numId w:val="21"/>
+        </w:numPr>
+        <w:spacing w:line="360" w:lineRule="auto"/>
+      </w:pPr>
+      <w:r>
+        <w:t>Draw a class diagram</w:t>
+      </w:r>
+      <w:r>
+        <w:br/>
+      </w:r>
+    </w:p>
+    <w:p>
+      <w:pPr>
+        <w:keepNext/>
+        <w:keepLines/>
+      </w:pPr>
+      <w:r>
+        <w:t>You should present your work using appropriate diagrams and supporting explanations where necessary.</w:t>
       </w:r>
     </w:p>
     <w:p/>
@@ -359,11 +767,14 @@
         <w:pStyle w:val="Heading3"/>
       </w:pPr>
       <w:r>
+        <w:lastRenderedPageBreak/>
         <w:t>Instructions</w:t>
       </w:r>
     </w:p>
     <w:p>
       <w:pPr>
+        <w:keepNext/>
+        <w:keepLines/>
         <w:numPr>
           <w:ilvl w:val="0"/>
           <w:numId w:val="4"/>
@@ -383,6 +794,8 @@
     </w:p>
     <w:p>
       <w:pPr>
+        <w:keepNext/>
+        <w:keepLines/>
         <w:numPr>
           <w:ilvl w:val="0"/>
           <w:numId w:val="4"/>
@@ -395,6 +808,8 @@
     </w:p>
     <w:p>
       <w:pPr>
+        <w:keepNext/>
+        <w:keepLines/>
         <w:numPr>
           <w:ilvl w:val="1"/>
           <w:numId w:val="4"/>
@@ -407,6 +822,8 @@
     </w:p>
     <w:p>
       <w:pPr>
+        <w:keepNext/>
+        <w:keepLines/>
         <w:numPr>
           <w:ilvl w:val="1"/>
           <w:numId w:val="4"/>
@@ -1479,6 +1896,155 @@
 <file path=word/numbering.xml><?xml version="1.0" encoding="utf-8"?>
 <w:numbering xmlns:wpc="http://schemas.microsoft.com/office/word/2010/wordprocessingCanvas" xmlns:cx="http://schemas.microsoft.com/office/drawing/2014/chartex" xmlns:cx1="http://schemas.microsoft.com/office/drawing/2015/9/8/chartex" xmlns:cx2="http://schemas.microsoft.com/office/drawing/2015/10/21/chartex" xmlns:cx3="http://schemas.microsoft.com/office/drawing/2016/5/9/chartex" xmlns:cx4="http://schemas.microsoft.com/office/drawing/2016/5/10/chartex" xmlns:cx5="http://schemas.microsoft.com/office/drawing/2016/5/11/chartex" xmlns:cx6="http://schemas.microsoft.com/office/drawing/2016/5/12/chartex" xmlns:cx7="http://schemas.microsoft.com/office/drawing/2016/5/13/chartex" xmlns:cx8="http://schemas.microsoft.com/office/drawing/2016/5/14/chartex" xmlns:mc="http://schemas.openxmlformats.org/markup-compatibility/2006" xmlns:aink="http://schemas.microsoft.com/office/drawing/2016/ink" xmlns:am3d="http://schemas.microsoft.com/office/drawing/2017/model3d" xmlns:o="urn:schemas-microsoft-com:office:office" xmlns:oel="http://schemas.microsoft.com/office/2019/extlst" xmlns:r="http://schemas.openxmlformats.org/officeDocument/2006/relationships" xmlns:m="http://schemas.openxmlformats.org/officeDocument/2006/math" xmlns:v="urn:schemas-microsoft-com:vml" xmlns:wp14="http://schemas.microsoft.com/office/word/2010/wordprocessingDrawing" xmlns:wp="http://schemas.openxmlformats.org/drawingml/2006/wordprocessingDrawing" xmlns:w10="urn:schemas-microsoft-com:office:word" xmlns:w="http://schemas.openxmlformats.org/wordprocessingml/2006/main" xmlns:w14="http://schemas.microsoft.com/office/word/2010/wordml" xmlns:w15="http://schemas.microsoft.com/office/word/2012/wordml" xmlns:w16cex="http://schemas.microsoft.com/office/word/2018/wordml/cex" xmlns:w16cid="http://schemas.microsoft.com/office/word/2016/wordml/cid" xmlns:w16="http://schemas.microsoft.com/office/word/2018/wordml" xmlns:w16du="http://schemas.microsoft.com/office/word/2023/wordml/word16du" xmlns:w16sdtdh="http://schemas.microsoft.com/office/word/2020/wordml/sdtdatahash" xmlns:w16sdtfl="http://schemas.microsoft.com/office/word/2024/wordml/sdtformatlock" xmlns:w16se="http://schemas.microsoft.com/office/word/2015/wordml/symex" xmlns:wpg="http://schemas.microsoft.com/office/word/2010/wordprocessingGroup" xmlns:wpi="http://schemas.microsoft.com/office/word/2010/wordprocessingInk" xmlns:wne="http://schemas.microsoft.com/office/word/2006/wordml" xmlns:wps="http://schemas.microsoft.com/office/word/2010/wordprocessingShape" mc:Ignorable="w14 w15 w16se w16cid w16 w16cex w16sdtdh w16sdtfl w16du wp14">
   <w:abstractNum w:abstractNumId="0" w15:restartNumberingAfterBreak="0">
+    <w:nsid w:val="16480D92"/>
+    <w:multiLevelType w:val="multilevel"/>
+    <w:tmpl w:val="A2841586"/>
+    <w:lvl w:ilvl="0">
+      <w:start w:val="1"/>
+      <w:numFmt w:val="bullet"/>
+      <w:lvlText w:val=""/>
+      <w:lvlJc w:val="left"/>
+      <w:pPr>
+        <w:tabs>
+          <w:tab w:val="num" w:pos="720"/>
+        </w:tabs>
+        <w:ind w:left="720" w:hanging="360"/>
+      </w:pPr>
+      <w:rPr>
+        <w:rFonts w:ascii="Symbol" w:hAnsi="Symbol" w:hint="default"/>
+        <w:sz w:val="20"/>
+      </w:rPr>
+    </w:lvl>
+    <w:lvl w:ilvl="1" w:tentative="1">
+      <w:start w:val="1"/>
+      <w:numFmt w:val="bullet"/>
+      <w:lvlText w:val="o"/>
+      <w:lvlJc w:val="left"/>
+      <w:pPr>
+        <w:tabs>
+          <w:tab w:val="num" w:pos="1440"/>
+        </w:tabs>
+        <w:ind w:left="1440" w:hanging="360"/>
+      </w:pPr>
+      <w:rPr>
+        <w:rFonts w:ascii="Courier New" w:hAnsi="Courier New" w:hint="default"/>
+        <w:sz w:val="20"/>
+      </w:rPr>
+    </w:lvl>
+    <w:lvl w:ilvl="2" w:tentative="1">
+      <w:start w:val="1"/>
+      <w:numFmt w:val="bullet"/>
+      <w:lvlText w:val=""/>
+      <w:lvlJc w:val="left"/>
+      <w:pPr>
+        <w:tabs>
+          <w:tab w:val="num" w:pos="2160"/>
+        </w:tabs>
+        <w:ind w:left="2160" w:hanging="360"/>
+      </w:pPr>
+      <w:rPr>
+        <w:rFonts w:ascii="Wingdings" w:hAnsi="Wingdings" w:hint="default"/>
+        <w:sz w:val="20"/>
+      </w:rPr>
+    </w:lvl>
+    <w:lvl w:ilvl="3" w:tentative="1">
+      <w:start w:val="1"/>
+      <w:numFmt w:val="bullet"/>
+      <w:lvlText w:val=""/>
+      <w:lvlJc w:val="left"/>
+      <w:pPr>
+        <w:tabs>
+          <w:tab w:val="num" w:pos="2880"/>
+        </w:tabs>
+        <w:ind w:left="2880" w:hanging="360"/>
+      </w:pPr>
+      <w:rPr>
+        <w:rFonts w:ascii="Wingdings" w:hAnsi="Wingdings" w:hint="default"/>
+        <w:sz w:val="20"/>
+      </w:rPr>
+    </w:lvl>
+    <w:lvl w:ilvl="4" w:tentative="1">
+      <w:start w:val="1"/>
+      <w:numFmt w:val="bullet"/>
+      <w:lvlText w:val=""/>
+      <w:lvlJc w:val="left"/>
+      <w:pPr>
+        <w:tabs>
+          <w:tab w:val="num" w:pos="3600"/>
+        </w:tabs>
+        <w:ind w:left="3600" w:hanging="360"/>
+      </w:pPr>
+      <w:rPr>
+        <w:rFonts w:ascii="Wingdings" w:hAnsi="Wingdings" w:hint="default"/>
+        <w:sz w:val="20"/>
+      </w:rPr>
+    </w:lvl>
+    <w:lvl w:ilvl="5" w:tentative="1">
+      <w:start w:val="1"/>
+      <w:numFmt w:val="bullet"/>
+      <w:lvlText w:val=""/>
+      <w:lvlJc w:val="left"/>
+      <w:pPr>
+        <w:tabs>
+          <w:tab w:val="num" w:pos="4320"/>
+        </w:tabs>
+        <w:ind w:left="4320" w:hanging="360"/>
+      </w:pPr>
+      <w:rPr>
+        <w:rFonts w:ascii="Wingdings" w:hAnsi="Wingdings" w:hint="default"/>
+        <w:sz w:val="20"/>
+      </w:rPr>
+    </w:lvl>
+    <w:lvl w:ilvl="6" w:tentative="1">
+      <w:start w:val="1"/>
+      <w:numFmt w:val="bullet"/>
+      <w:lvlText w:val=""/>
+      <w:lvlJc w:val="left"/>
+      <w:pPr>
+        <w:tabs>
+          <w:tab w:val="num" w:pos="5040"/>
+        </w:tabs>
+        <w:ind w:left="5040" w:hanging="360"/>
+      </w:pPr>
+      <w:rPr>
+        <w:rFonts w:ascii="Wingdings" w:hAnsi="Wingdings" w:hint="default"/>
+        <w:sz w:val="20"/>
+      </w:rPr>
+    </w:lvl>
+    <w:lvl w:ilvl="7" w:tentative="1">
+      <w:start w:val="1"/>
+      <w:numFmt w:val="bullet"/>
+      <w:lvlText w:val=""/>
+      <w:lvlJc w:val="left"/>
+      <w:pPr>
+        <w:tabs>
+          <w:tab w:val="num" w:pos="5760"/>
+        </w:tabs>
+        <w:ind w:left="5760" w:hanging="360"/>
+      </w:pPr>
+      <w:rPr>
+        <w:rFonts w:ascii="Wingdings" w:hAnsi="Wingdings" w:hint="default"/>
+        <w:sz w:val="20"/>
+      </w:rPr>
+    </w:lvl>
+    <w:lvl w:ilvl="8" w:tentative="1">
+      <w:start w:val="1"/>
+      <w:numFmt w:val="bullet"/>
+      <w:lvlText w:val=""/>
+      <w:lvlJc w:val="left"/>
+      <w:pPr>
+        <w:tabs>
+          <w:tab w:val="num" w:pos="6480"/>
+        </w:tabs>
+        <w:ind w:left="6480" w:hanging="360"/>
+      </w:pPr>
+      <w:rPr>
+        <w:rFonts w:ascii="Wingdings" w:hAnsi="Wingdings" w:hint="default"/>
+        <w:sz w:val="20"/>
+      </w:rPr>
+    </w:lvl>
+  </w:abstractNum>
+  <w:abstractNum w:abstractNumId="1" w15:restartNumberingAfterBreak="0">
     <w:nsid w:val="1C397281"/>
     <w:multiLevelType w:val="multilevel"/>
     <w:tmpl w:val="16E224AE"/>
@@ -1627,7 +2193,156 @@
       </w:rPr>
     </w:lvl>
   </w:abstractNum>
-  <w:abstractNum w:abstractNumId="1" w15:restartNumberingAfterBreak="0">
+  <w:abstractNum w:abstractNumId="2" w15:restartNumberingAfterBreak="0">
+    <w:nsid w:val="1CD268C4"/>
+    <w:multiLevelType w:val="multilevel"/>
+    <w:tmpl w:val="C418760C"/>
+    <w:lvl w:ilvl="0">
+      <w:start w:val="1"/>
+      <w:numFmt w:val="bullet"/>
+      <w:lvlText w:val=""/>
+      <w:lvlJc w:val="left"/>
+      <w:pPr>
+        <w:tabs>
+          <w:tab w:val="num" w:pos="720"/>
+        </w:tabs>
+        <w:ind w:left="720" w:hanging="360"/>
+      </w:pPr>
+      <w:rPr>
+        <w:rFonts w:ascii="Symbol" w:hAnsi="Symbol" w:hint="default"/>
+        <w:sz w:val="20"/>
+      </w:rPr>
+    </w:lvl>
+    <w:lvl w:ilvl="1" w:tentative="1">
+      <w:start w:val="1"/>
+      <w:numFmt w:val="bullet"/>
+      <w:lvlText w:val="o"/>
+      <w:lvlJc w:val="left"/>
+      <w:pPr>
+        <w:tabs>
+          <w:tab w:val="num" w:pos="1440"/>
+        </w:tabs>
+        <w:ind w:left="1440" w:hanging="360"/>
+      </w:pPr>
+      <w:rPr>
+        <w:rFonts w:ascii="Courier New" w:hAnsi="Courier New" w:hint="default"/>
+        <w:sz w:val="20"/>
+      </w:rPr>
+    </w:lvl>
+    <w:lvl w:ilvl="2" w:tentative="1">
+      <w:start w:val="1"/>
+      <w:numFmt w:val="bullet"/>
+      <w:lvlText w:val=""/>
+      <w:lvlJc w:val="left"/>
+      <w:pPr>
+        <w:tabs>
+          <w:tab w:val="num" w:pos="2160"/>
+        </w:tabs>
+        <w:ind w:left="2160" w:hanging="360"/>
+      </w:pPr>
+      <w:rPr>
+        <w:rFonts w:ascii="Wingdings" w:hAnsi="Wingdings" w:hint="default"/>
+        <w:sz w:val="20"/>
+      </w:rPr>
+    </w:lvl>
+    <w:lvl w:ilvl="3" w:tentative="1">
+      <w:start w:val="1"/>
+      <w:numFmt w:val="bullet"/>
+      <w:lvlText w:val=""/>
+      <w:lvlJc w:val="left"/>
+      <w:pPr>
+        <w:tabs>
+          <w:tab w:val="num" w:pos="2880"/>
+        </w:tabs>
+        <w:ind w:left="2880" w:hanging="360"/>
+      </w:pPr>
+      <w:rPr>
+        <w:rFonts w:ascii="Wingdings" w:hAnsi="Wingdings" w:hint="default"/>
+        <w:sz w:val="20"/>
+      </w:rPr>
+    </w:lvl>
+    <w:lvl w:ilvl="4" w:tentative="1">
+      <w:start w:val="1"/>
+      <w:numFmt w:val="bullet"/>
+      <w:lvlText w:val=""/>
+      <w:lvlJc w:val="left"/>
+      <w:pPr>
+        <w:tabs>
+          <w:tab w:val="num" w:pos="3600"/>
+        </w:tabs>
+        <w:ind w:left="3600" w:hanging="360"/>
+      </w:pPr>
+      <w:rPr>
+        <w:rFonts w:ascii="Wingdings" w:hAnsi="Wingdings" w:hint="default"/>
+        <w:sz w:val="20"/>
+      </w:rPr>
+    </w:lvl>
+    <w:lvl w:ilvl="5" w:tentative="1">
+      <w:start w:val="1"/>
+      <w:numFmt w:val="bullet"/>
+      <w:lvlText w:val=""/>
+      <w:lvlJc w:val="left"/>
+      <w:pPr>
+        <w:tabs>
+          <w:tab w:val="num" w:pos="4320"/>
+        </w:tabs>
+        <w:ind w:left="4320" w:hanging="360"/>
+      </w:pPr>
+      <w:rPr>
+        <w:rFonts w:ascii="Wingdings" w:hAnsi="Wingdings" w:hint="default"/>
+        <w:sz w:val="20"/>
+      </w:rPr>
+    </w:lvl>
+    <w:lvl w:ilvl="6" w:tentative="1">
+      <w:start w:val="1"/>
+      <w:numFmt w:val="bullet"/>
+      <w:lvlText w:val=""/>
+      <w:lvlJc w:val="left"/>
+      <w:pPr>
+        <w:tabs>
+          <w:tab w:val="num" w:pos="5040"/>
+        </w:tabs>
+        <w:ind w:left="5040" w:hanging="360"/>
+      </w:pPr>
+      <w:rPr>
+        <w:rFonts w:ascii="Wingdings" w:hAnsi="Wingdings" w:hint="default"/>
+        <w:sz w:val="20"/>
+      </w:rPr>
+    </w:lvl>
+    <w:lvl w:ilvl="7" w:tentative="1">
+      <w:start w:val="1"/>
+      <w:numFmt w:val="bullet"/>
+      <w:lvlText w:val=""/>
+      <w:lvlJc w:val="left"/>
+      <w:pPr>
+        <w:tabs>
+          <w:tab w:val="num" w:pos="5760"/>
+        </w:tabs>
+        <w:ind w:left="5760" w:hanging="360"/>
+      </w:pPr>
+      <w:rPr>
+        <w:rFonts w:ascii="Wingdings" w:hAnsi="Wingdings" w:hint="default"/>
+        <w:sz w:val="20"/>
+      </w:rPr>
+    </w:lvl>
+    <w:lvl w:ilvl="8" w:tentative="1">
+      <w:start w:val="1"/>
+      <w:numFmt w:val="bullet"/>
+      <w:lvlText w:val=""/>
+      <w:lvlJc w:val="left"/>
+      <w:pPr>
+        <w:tabs>
+          <w:tab w:val="num" w:pos="6480"/>
+        </w:tabs>
+        <w:ind w:left="6480" w:hanging="360"/>
+      </w:pPr>
+      <w:rPr>
+        <w:rFonts w:ascii="Wingdings" w:hAnsi="Wingdings" w:hint="default"/>
+        <w:sz w:val="20"/>
+      </w:rPr>
+    </w:lvl>
+  </w:abstractNum>
+  <w:abstractNum w:abstractNumId="3" w15:restartNumberingAfterBreak="0">
     <w:nsid w:val="20644D0C"/>
     <w:multiLevelType w:val="multilevel"/>
     <w:tmpl w:val="3978FDEA"/>
@@ -1776,7 +2491,156 @@
       </w:rPr>
     </w:lvl>
   </w:abstractNum>
-  <w:abstractNum w:abstractNumId="2" w15:restartNumberingAfterBreak="0">
+  <w:abstractNum w:abstractNumId="4" w15:restartNumberingAfterBreak="0">
+    <w:nsid w:val="22DB5E7B"/>
+    <w:multiLevelType w:val="multilevel"/>
+    <w:tmpl w:val="CDB2DE3C"/>
+    <w:lvl w:ilvl="0">
+      <w:start w:val="1"/>
+      <w:numFmt w:val="bullet"/>
+      <w:lvlText w:val=""/>
+      <w:lvlJc w:val="left"/>
+      <w:pPr>
+        <w:tabs>
+          <w:tab w:val="num" w:pos="720"/>
+        </w:tabs>
+        <w:ind w:left="720" w:hanging="360"/>
+      </w:pPr>
+      <w:rPr>
+        <w:rFonts w:ascii="Symbol" w:hAnsi="Symbol" w:hint="default"/>
+        <w:sz w:val="20"/>
+      </w:rPr>
+    </w:lvl>
+    <w:lvl w:ilvl="1" w:tentative="1">
+      <w:start w:val="1"/>
+      <w:numFmt w:val="bullet"/>
+      <w:lvlText w:val="o"/>
+      <w:lvlJc w:val="left"/>
+      <w:pPr>
+        <w:tabs>
+          <w:tab w:val="num" w:pos="1440"/>
+        </w:tabs>
+        <w:ind w:left="1440" w:hanging="360"/>
+      </w:pPr>
+      <w:rPr>
+        <w:rFonts w:ascii="Courier New" w:hAnsi="Courier New" w:hint="default"/>
+        <w:sz w:val="20"/>
+      </w:rPr>
+    </w:lvl>
+    <w:lvl w:ilvl="2" w:tentative="1">
+      <w:start w:val="1"/>
+      <w:numFmt w:val="bullet"/>
+      <w:lvlText w:val=""/>
+      <w:lvlJc w:val="left"/>
+      <w:pPr>
+        <w:tabs>
+          <w:tab w:val="num" w:pos="2160"/>
+        </w:tabs>
+        <w:ind w:left="2160" w:hanging="360"/>
+      </w:pPr>
+      <w:rPr>
+        <w:rFonts w:ascii="Wingdings" w:hAnsi="Wingdings" w:hint="default"/>
+        <w:sz w:val="20"/>
+      </w:rPr>
+    </w:lvl>
+    <w:lvl w:ilvl="3" w:tentative="1">
+      <w:start w:val="1"/>
+      <w:numFmt w:val="bullet"/>
+      <w:lvlText w:val=""/>
+      <w:lvlJc w:val="left"/>
+      <w:pPr>
+        <w:tabs>
+          <w:tab w:val="num" w:pos="2880"/>
+        </w:tabs>
+        <w:ind w:left="2880" w:hanging="360"/>
+      </w:pPr>
+      <w:rPr>
+        <w:rFonts w:ascii="Wingdings" w:hAnsi="Wingdings" w:hint="default"/>
+        <w:sz w:val="20"/>
+      </w:rPr>
+    </w:lvl>
+    <w:lvl w:ilvl="4" w:tentative="1">
+      <w:start w:val="1"/>
+      <w:numFmt w:val="bullet"/>
+      <w:lvlText w:val=""/>
+      <w:lvlJc w:val="left"/>
+      <w:pPr>
+        <w:tabs>
+          <w:tab w:val="num" w:pos="3600"/>
+        </w:tabs>
+        <w:ind w:left="3600" w:hanging="360"/>
+      </w:pPr>
+      <w:rPr>
+        <w:rFonts w:ascii="Wingdings" w:hAnsi="Wingdings" w:hint="default"/>
+        <w:sz w:val="20"/>
+      </w:rPr>
+    </w:lvl>
+    <w:lvl w:ilvl="5" w:tentative="1">
+      <w:start w:val="1"/>
+      <w:numFmt w:val="bullet"/>
+      <w:lvlText w:val=""/>
+      <w:lvlJc w:val="left"/>
+      <w:pPr>
+        <w:tabs>
+          <w:tab w:val="num" w:pos="4320"/>
+        </w:tabs>
+        <w:ind w:left="4320" w:hanging="360"/>
+      </w:pPr>
+      <w:rPr>
+        <w:rFonts w:ascii="Wingdings" w:hAnsi="Wingdings" w:hint="default"/>
+        <w:sz w:val="20"/>
+      </w:rPr>
+    </w:lvl>
+    <w:lvl w:ilvl="6" w:tentative="1">
+      <w:start w:val="1"/>
+      <w:numFmt w:val="bullet"/>
+      <w:lvlText w:val=""/>
+      <w:lvlJc w:val="left"/>
+      <w:pPr>
+        <w:tabs>
+          <w:tab w:val="num" w:pos="5040"/>
+        </w:tabs>
+        <w:ind w:left="5040" w:hanging="360"/>
+      </w:pPr>
+      <w:rPr>
+        <w:rFonts w:ascii="Wingdings" w:hAnsi="Wingdings" w:hint="default"/>
+        <w:sz w:val="20"/>
+      </w:rPr>
+    </w:lvl>
+    <w:lvl w:ilvl="7" w:tentative="1">
+      <w:start w:val="1"/>
+      <w:numFmt w:val="bullet"/>
+      <w:lvlText w:val=""/>
+      <w:lvlJc w:val="left"/>
+      <w:pPr>
+        <w:tabs>
+          <w:tab w:val="num" w:pos="5760"/>
+        </w:tabs>
+        <w:ind w:left="5760" w:hanging="360"/>
+      </w:pPr>
+      <w:rPr>
+        <w:rFonts w:ascii="Wingdings" w:hAnsi="Wingdings" w:hint="default"/>
+        <w:sz w:val="20"/>
+      </w:rPr>
+    </w:lvl>
+    <w:lvl w:ilvl="8" w:tentative="1">
+      <w:start w:val="1"/>
+      <w:numFmt w:val="bullet"/>
+      <w:lvlText w:val=""/>
+      <w:lvlJc w:val="left"/>
+      <w:pPr>
+        <w:tabs>
+          <w:tab w:val="num" w:pos="6480"/>
+        </w:tabs>
+        <w:ind w:left="6480" w:hanging="360"/>
+      </w:pPr>
+      <w:rPr>
+        <w:rFonts w:ascii="Wingdings" w:hAnsi="Wingdings" w:hint="default"/>
+        <w:sz w:val="20"/>
+      </w:rPr>
+    </w:lvl>
+  </w:abstractNum>
+  <w:abstractNum w:abstractNumId="5" w15:restartNumberingAfterBreak="0">
     <w:nsid w:val="29A5512C"/>
     <w:multiLevelType w:val="multilevel"/>
     <w:tmpl w:val="869A5F3A"/>
@@ -1925,7 +2789,305 @@
       </w:rPr>
     </w:lvl>
   </w:abstractNum>
-  <w:abstractNum w:abstractNumId="3" w15:restartNumberingAfterBreak="0">
+  <w:abstractNum w:abstractNumId="6" w15:restartNumberingAfterBreak="0">
+    <w:nsid w:val="463D5946"/>
+    <w:multiLevelType w:val="multilevel"/>
+    <w:tmpl w:val="3BD4A9E8"/>
+    <w:lvl w:ilvl="0">
+      <w:start w:val="1"/>
+      <w:numFmt w:val="bullet"/>
+      <w:lvlText w:val=""/>
+      <w:lvlJc w:val="left"/>
+      <w:pPr>
+        <w:tabs>
+          <w:tab w:val="num" w:pos="720"/>
+        </w:tabs>
+        <w:ind w:left="720" w:hanging="360"/>
+      </w:pPr>
+      <w:rPr>
+        <w:rFonts w:ascii="Symbol" w:hAnsi="Symbol" w:hint="default"/>
+        <w:sz w:val="20"/>
+      </w:rPr>
+    </w:lvl>
+    <w:lvl w:ilvl="1" w:tentative="1">
+      <w:start w:val="1"/>
+      <w:numFmt w:val="bullet"/>
+      <w:lvlText w:val="o"/>
+      <w:lvlJc w:val="left"/>
+      <w:pPr>
+        <w:tabs>
+          <w:tab w:val="num" w:pos="1440"/>
+        </w:tabs>
+        <w:ind w:left="1440" w:hanging="360"/>
+      </w:pPr>
+      <w:rPr>
+        <w:rFonts w:ascii="Courier New" w:hAnsi="Courier New" w:hint="default"/>
+        <w:sz w:val="20"/>
+      </w:rPr>
+    </w:lvl>
+    <w:lvl w:ilvl="2" w:tentative="1">
+      <w:start w:val="1"/>
+      <w:numFmt w:val="bullet"/>
+      <w:lvlText w:val=""/>
+      <w:lvlJc w:val="left"/>
+      <w:pPr>
+        <w:tabs>
+          <w:tab w:val="num" w:pos="2160"/>
+        </w:tabs>
+        <w:ind w:left="2160" w:hanging="360"/>
+      </w:pPr>
+      <w:rPr>
+        <w:rFonts w:ascii="Wingdings" w:hAnsi="Wingdings" w:hint="default"/>
+        <w:sz w:val="20"/>
+      </w:rPr>
+    </w:lvl>
+    <w:lvl w:ilvl="3" w:tentative="1">
+      <w:start w:val="1"/>
+      <w:numFmt w:val="bullet"/>
+      <w:lvlText w:val=""/>
+      <w:lvlJc w:val="left"/>
+      <w:pPr>
+        <w:tabs>
+          <w:tab w:val="num" w:pos="2880"/>
+        </w:tabs>
+        <w:ind w:left="2880" w:hanging="360"/>
+      </w:pPr>
+      <w:rPr>
+        <w:rFonts w:ascii="Wingdings" w:hAnsi="Wingdings" w:hint="default"/>
+        <w:sz w:val="20"/>
+      </w:rPr>
+    </w:lvl>
+    <w:lvl w:ilvl="4" w:tentative="1">
+      <w:start w:val="1"/>
+      <w:numFmt w:val="bullet"/>
+      <w:lvlText w:val=""/>
+      <w:lvlJc w:val="left"/>
+      <w:pPr>
+        <w:tabs>
+          <w:tab w:val="num" w:pos="3600"/>
+        </w:tabs>
+        <w:ind w:left="3600" w:hanging="360"/>
+      </w:pPr>
+      <w:rPr>
+        <w:rFonts w:ascii="Wingdings" w:hAnsi="Wingdings" w:hint="default"/>
+        <w:sz w:val="20"/>
+      </w:rPr>
+    </w:lvl>
+    <w:lvl w:ilvl="5" w:tentative="1">
+      <w:start w:val="1"/>
+      <w:numFmt w:val="bullet"/>
+      <w:lvlText w:val=""/>
+      <w:lvlJc w:val="left"/>
+      <w:pPr>
+        <w:tabs>
+          <w:tab w:val="num" w:pos="4320"/>
+        </w:tabs>
+        <w:ind w:left="4320" w:hanging="360"/>
+      </w:pPr>
+      <w:rPr>
+        <w:rFonts w:ascii="Wingdings" w:hAnsi="Wingdings" w:hint="default"/>
+        <w:sz w:val="20"/>
+      </w:rPr>
+    </w:lvl>
+    <w:lvl w:ilvl="6" w:tentative="1">
+      <w:start w:val="1"/>
+      <w:numFmt w:val="bullet"/>
+      <w:lvlText w:val=""/>
+      <w:lvlJc w:val="left"/>
+      <w:pPr>
+        <w:tabs>
+          <w:tab w:val="num" w:pos="5040"/>
+        </w:tabs>
+        <w:ind w:left="5040" w:hanging="360"/>
+      </w:pPr>
+      <w:rPr>
+        <w:rFonts w:ascii="Wingdings" w:hAnsi="Wingdings" w:hint="default"/>
+        <w:sz w:val="20"/>
+      </w:rPr>
+    </w:lvl>
+    <w:lvl w:ilvl="7" w:tentative="1">
+      <w:start w:val="1"/>
+      <w:numFmt w:val="bullet"/>
+      <w:lvlText w:val=""/>
+      <w:lvlJc w:val="left"/>
+      <w:pPr>
+        <w:tabs>
+          <w:tab w:val="num" w:pos="5760"/>
+        </w:tabs>
+        <w:ind w:left="5760" w:hanging="360"/>
+      </w:pPr>
+      <w:rPr>
+        <w:rFonts w:ascii="Wingdings" w:hAnsi="Wingdings" w:hint="default"/>
+        <w:sz w:val="20"/>
+      </w:rPr>
+    </w:lvl>
+    <w:lvl w:ilvl="8" w:tentative="1">
+      <w:start w:val="1"/>
+      <w:numFmt w:val="bullet"/>
+      <w:lvlText w:val=""/>
+      <w:lvlJc w:val="left"/>
+      <w:pPr>
+        <w:tabs>
+          <w:tab w:val="num" w:pos="6480"/>
+        </w:tabs>
+        <w:ind w:left="6480" w:hanging="360"/>
+      </w:pPr>
+      <w:rPr>
+        <w:rFonts w:ascii="Wingdings" w:hAnsi="Wingdings" w:hint="default"/>
+        <w:sz w:val="20"/>
+      </w:rPr>
+    </w:lvl>
+  </w:abstractNum>
+  <w:abstractNum w:abstractNumId="7" w15:restartNumberingAfterBreak="0">
+    <w:nsid w:val="49476EA4"/>
+    <w:multiLevelType w:val="multilevel"/>
+    <w:tmpl w:val="A05EB12E"/>
+    <w:lvl w:ilvl="0">
+      <w:start w:val="1"/>
+      <w:numFmt w:val="bullet"/>
+      <w:lvlText w:val=""/>
+      <w:lvlJc w:val="left"/>
+      <w:pPr>
+        <w:tabs>
+          <w:tab w:val="num" w:pos="720"/>
+        </w:tabs>
+        <w:ind w:left="720" w:hanging="360"/>
+      </w:pPr>
+      <w:rPr>
+        <w:rFonts w:ascii="Symbol" w:hAnsi="Symbol" w:hint="default"/>
+        <w:sz w:val="20"/>
+      </w:rPr>
+    </w:lvl>
+    <w:lvl w:ilvl="1" w:tentative="1">
+      <w:start w:val="1"/>
+      <w:numFmt w:val="bullet"/>
+      <w:lvlText w:val="o"/>
+      <w:lvlJc w:val="left"/>
+      <w:pPr>
+        <w:tabs>
+          <w:tab w:val="num" w:pos="1440"/>
+        </w:tabs>
+        <w:ind w:left="1440" w:hanging="360"/>
+      </w:pPr>
+      <w:rPr>
+        <w:rFonts w:ascii="Courier New" w:hAnsi="Courier New" w:hint="default"/>
+        <w:sz w:val="20"/>
+      </w:rPr>
+    </w:lvl>
+    <w:lvl w:ilvl="2" w:tentative="1">
+      <w:start w:val="1"/>
+      <w:numFmt w:val="bullet"/>
+      <w:lvlText w:val=""/>
+      <w:lvlJc w:val="left"/>
+      <w:pPr>
+        <w:tabs>
+          <w:tab w:val="num" w:pos="2160"/>
+        </w:tabs>
+        <w:ind w:left="2160" w:hanging="360"/>
+      </w:pPr>
+      <w:rPr>
+        <w:rFonts w:ascii="Wingdings" w:hAnsi="Wingdings" w:hint="default"/>
+        <w:sz w:val="20"/>
+      </w:rPr>
+    </w:lvl>
+    <w:lvl w:ilvl="3" w:tentative="1">
+      <w:start w:val="1"/>
+      <w:numFmt w:val="bullet"/>
+      <w:lvlText w:val=""/>
+      <w:lvlJc w:val="left"/>
+      <w:pPr>
+        <w:tabs>
+          <w:tab w:val="num" w:pos="2880"/>
+        </w:tabs>
+        <w:ind w:left="2880" w:hanging="360"/>
+      </w:pPr>
+      <w:rPr>
+        <w:rFonts w:ascii="Wingdings" w:hAnsi="Wingdings" w:hint="default"/>
+        <w:sz w:val="20"/>
+      </w:rPr>
+    </w:lvl>
+    <w:lvl w:ilvl="4" w:tentative="1">
+      <w:start w:val="1"/>
+      <w:numFmt w:val="bullet"/>
+      <w:lvlText w:val=""/>
+      <w:lvlJc w:val="left"/>
+      <w:pPr>
+        <w:tabs>
+          <w:tab w:val="num" w:pos="3600"/>
+        </w:tabs>
+        <w:ind w:left="3600" w:hanging="360"/>
+      </w:pPr>
+      <w:rPr>
+        <w:rFonts w:ascii="Wingdings" w:hAnsi="Wingdings" w:hint="default"/>
+        <w:sz w:val="20"/>
+      </w:rPr>
+    </w:lvl>
+    <w:lvl w:ilvl="5" w:tentative="1">
+      <w:start w:val="1"/>
+      <w:numFmt w:val="bullet"/>
+      <w:lvlText w:val=""/>
+      <w:lvlJc w:val="left"/>
+      <w:pPr>
+        <w:tabs>
+          <w:tab w:val="num" w:pos="4320"/>
+        </w:tabs>
+        <w:ind w:left="4320" w:hanging="360"/>
+      </w:pPr>
+      <w:rPr>
+        <w:rFonts w:ascii="Wingdings" w:hAnsi="Wingdings" w:hint="default"/>
+        <w:sz w:val="20"/>
+      </w:rPr>
+    </w:lvl>
+    <w:lvl w:ilvl="6" w:tentative="1">
+      <w:start w:val="1"/>
+      <w:numFmt w:val="bullet"/>
+      <w:lvlText w:val=""/>
+      <w:lvlJc w:val="left"/>
+      <w:pPr>
+        <w:tabs>
+          <w:tab w:val="num" w:pos="5040"/>
+        </w:tabs>
+        <w:ind w:left="5040" w:hanging="360"/>
+      </w:pPr>
+      <w:rPr>
+        <w:rFonts w:ascii="Wingdings" w:hAnsi="Wingdings" w:hint="default"/>
+        <w:sz w:val="20"/>
+      </w:rPr>
+    </w:lvl>
+    <w:lvl w:ilvl="7" w:tentative="1">
+      <w:start w:val="1"/>
+      <w:numFmt w:val="bullet"/>
+      <w:lvlText w:val=""/>
+      <w:lvlJc w:val="left"/>
+      <w:pPr>
+        <w:tabs>
+          <w:tab w:val="num" w:pos="5760"/>
+        </w:tabs>
+        <w:ind w:left="5760" w:hanging="360"/>
+      </w:pPr>
+      <w:rPr>
+        <w:rFonts w:ascii="Wingdings" w:hAnsi="Wingdings" w:hint="default"/>
+        <w:sz w:val="20"/>
+      </w:rPr>
+    </w:lvl>
+    <w:lvl w:ilvl="8" w:tentative="1">
+      <w:start w:val="1"/>
+      <w:numFmt w:val="bullet"/>
+      <w:lvlText w:val=""/>
+      <w:lvlJc w:val="left"/>
+      <w:pPr>
+        <w:tabs>
+          <w:tab w:val="num" w:pos="6480"/>
+        </w:tabs>
+        <w:ind w:left="6480" w:hanging="360"/>
+      </w:pPr>
+      <w:rPr>
+        <w:rFonts w:ascii="Wingdings" w:hAnsi="Wingdings" w:hint="default"/>
+        <w:sz w:val="20"/>
+      </w:rPr>
+    </w:lvl>
+  </w:abstractNum>
+  <w:abstractNum w:abstractNumId="8" w15:restartNumberingAfterBreak="0">
     <w:nsid w:val="4AB709BA"/>
     <w:multiLevelType w:val="multilevel"/>
     <w:tmpl w:val="B41C2DB6"/>
@@ -2074,7 +3236,7 @@
       </w:rPr>
     </w:lvl>
   </w:abstractNum>
-  <w:abstractNum w:abstractNumId="4" w15:restartNumberingAfterBreak="0">
+  <w:abstractNum w:abstractNumId="9" w15:restartNumberingAfterBreak="0">
     <w:nsid w:val="4B651AD2"/>
     <w:multiLevelType w:val="multilevel"/>
     <w:tmpl w:val="3392BD22"/>
@@ -2223,7 +3385,7 @@
       </w:rPr>
     </w:lvl>
   </w:abstractNum>
-  <w:abstractNum w:abstractNumId="5" w15:restartNumberingAfterBreak="0">
+  <w:abstractNum w:abstractNumId="10" w15:restartNumberingAfterBreak="0">
     <w:nsid w:val="521F41F1"/>
     <w:multiLevelType w:val="multilevel"/>
     <w:tmpl w:val="0BF8885E"/>
@@ -2372,7 +3534,7 @@
       </w:rPr>
     </w:lvl>
   </w:abstractNum>
-  <w:abstractNum w:abstractNumId="6" w15:restartNumberingAfterBreak="0">
+  <w:abstractNum w:abstractNumId="11" w15:restartNumberingAfterBreak="0">
     <w:nsid w:val="56640D59"/>
     <w:multiLevelType w:val="multilevel"/>
     <w:tmpl w:val="9FC27DE0"/>
@@ -2521,7 +3683,7 @@
       </w:rPr>
     </w:lvl>
   </w:abstractNum>
-  <w:abstractNum w:abstractNumId="7" w15:restartNumberingAfterBreak="0">
+  <w:abstractNum w:abstractNumId="12" w15:restartNumberingAfterBreak="0">
     <w:nsid w:val="61122D5A"/>
     <w:multiLevelType w:val="multilevel"/>
     <w:tmpl w:val="4448D1A6"/>
@@ -2670,7 +3832,7 @@
       </w:rPr>
     </w:lvl>
   </w:abstractNum>
-  <w:abstractNum w:abstractNumId="8" w15:restartNumberingAfterBreak="0">
+  <w:abstractNum w:abstractNumId="13" w15:restartNumberingAfterBreak="0">
     <w:nsid w:val="68112440"/>
     <w:multiLevelType w:val="multilevel"/>
     <w:tmpl w:val="E93C683E"/>
@@ -2787,7 +3949,7 @@
       </w:pPr>
     </w:lvl>
   </w:abstractNum>
-  <w:abstractNum w:abstractNumId="9" w15:restartNumberingAfterBreak="0">
+  <w:abstractNum w:abstractNumId="14" w15:restartNumberingAfterBreak="0">
     <w:nsid w:val="68247E4A"/>
     <w:multiLevelType w:val="multilevel"/>
     <w:tmpl w:val="834EF034"/>
@@ -2936,7 +4098,7 @@
       </w:rPr>
     </w:lvl>
   </w:abstractNum>
-  <w:abstractNum w:abstractNumId="10" w15:restartNumberingAfterBreak="0">
+  <w:abstractNum w:abstractNumId="15" w15:restartNumberingAfterBreak="0">
     <w:nsid w:val="6859677E"/>
     <w:multiLevelType w:val="multilevel"/>
     <w:tmpl w:val="579A175A"/>
@@ -3085,7 +4247,7 @@
       </w:rPr>
     </w:lvl>
   </w:abstractNum>
-  <w:abstractNum w:abstractNumId="11" w15:restartNumberingAfterBreak="0">
+  <w:abstractNum w:abstractNumId="16" w15:restartNumberingAfterBreak="0">
     <w:nsid w:val="6A41085F"/>
     <w:multiLevelType w:val="multilevel"/>
     <w:tmpl w:val="B1102B86"/>
@@ -3234,7 +4396,7 @@
       </w:rPr>
     </w:lvl>
   </w:abstractNum>
-  <w:abstractNum w:abstractNumId="12" w15:restartNumberingAfterBreak="0">
+  <w:abstractNum w:abstractNumId="17" w15:restartNumberingAfterBreak="0">
     <w:nsid w:val="6F6A064B"/>
     <w:multiLevelType w:val="multilevel"/>
     <w:tmpl w:val="15FCB648"/>
@@ -3347,7 +4509,7 @@
       </w:pPr>
     </w:lvl>
   </w:abstractNum>
-  <w:abstractNum w:abstractNumId="13" w15:restartNumberingAfterBreak="0">
+  <w:abstractNum w:abstractNumId="18" w15:restartNumberingAfterBreak="0">
     <w:nsid w:val="7AC34E46"/>
     <w:multiLevelType w:val="multilevel"/>
     <w:tmpl w:val="529CC0D6"/>
@@ -3496,7 +4658,7 @@
       </w:rPr>
     </w:lvl>
   </w:abstractNum>
-  <w:abstractNum w:abstractNumId="14" w15:restartNumberingAfterBreak="0">
+  <w:abstractNum w:abstractNumId="19" w15:restartNumberingAfterBreak="0">
     <w:nsid w:val="7BF11DAC"/>
     <w:multiLevelType w:val="multilevel"/>
     <w:tmpl w:val="EADC87EC"/>
@@ -3645,7 +4807,7 @@
       </w:rPr>
     </w:lvl>
   </w:abstractNum>
-  <w:abstractNum w:abstractNumId="15" w15:restartNumberingAfterBreak="0">
+  <w:abstractNum w:abstractNumId="20" w15:restartNumberingAfterBreak="0">
     <w:nsid w:val="7FBC1CF2"/>
     <w:multiLevelType w:val="multilevel"/>
     <w:tmpl w:val="47AC1840"/>
@@ -3795,52 +4957,67 @@
     </w:lvl>
   </w:abstractNum>
   <w:num w:numId="1" w16cid:durableId="1688827029">
+    <w:abstractNumId w:val="20"/>
+  </w:num>
+  <w:num w:numId="2" w16cid:durableId="114494793">
+    <w:abstractNumId w:val="8"/>
+  </w:num>
+  <w:num w:numId="3" w16cid:durableId="814445785">
     <w:abstractNumId w:val="15"/>
   </w:num>
-  <w:num w:numId="2" w16cid:durableId="114494793">
+  <w:num w:numId="4" w16cid:durableId="1179855347">
+    <w:abstractNumId w:val="13"/>
+  </w:num>
+  <w:num w:numId="5" w16cid:durableId="830561655">
+    <w:abstractNumId w:val="18"/>
+  </w:num>
+  <w:num w:numId="6" w16cid:durableId="1026101219">
+    <w:abstractNumId w:val="11"/>
+  </w:num>
+  <w:num w:numId="7" w16cid:durableId="977682925">
+    <w:abstractNumId w:val="1"/>
+  </w:num>
+  <w:num w:numId="8" w16cid:durableId="94133373">
+    <w:abstractNumId w:val="10"/>
+  </w:num>
+  <w:num w:numId="9" w16cid:durableId="1708598032">
+    <w:abstractNumId w:val="19"/>
+  </w:num>
+  <w:num w:numId="10" w16cid:durableId="608002620">
+    <w:abstractNumId w:val="9"/>
+  </w:num>
+  <w:num w:numId="11" w16cid:durableId="1246112386">
+    <w:abstractNumId w:val="14"/>
+  </w:num>
+  <w:num w:numId="12" w16cid:durableId="88628754">
+    <w:abstractNumId w:val="16"/>
+  </w:num>
+  <w:num w:numId="13" w16cid:durableId="1478110016">
     <w:abstractNumId w:val="3"/>
   </w:num>
-  <w:num w:numId="3" w16cid:durableId="814445785">
-    <w:abstractNumId w:val="10"/>
+  <w:num w:numId="14" w16cid:durableId="1280140075">
+    <w:abstractNumId w:val="17"/>
   </w:num>
-  <w:num w:numId="4" w16cid:durableId="1179855347">
-    <w:abstractNumId w:val="8"/>
+  <w:num w:numId="15" w16cid:durableId="1216308199">
+    <w:abstractNumId w:val="5"/>
   </w:num>
-  <w:num w:numId="5" w16cid:durableId="830561655">
-    <w:abstractNumId w:val="13"/>
+  <w:num w:numId="16" w16cid:durableId="987979862">
+    <w:abstractNumId w:val="12"/>
   </w:num>
-  <w:num w:numId="6" w16cid:durableId="1026101219">
+  <w:num w:numId="17" w16cid:durableId="1644383597">
     <w:abstractNumId w:val="6"/>
   </w:num>
-  <w:num w:numId="7" w16cid:durableId="977682925">
+  <w:num w:numId="18" w16cid:durableId="524051790">
     <w:abstractNumId w:val="0"/>
   </w:num>
-  <w:num w:numId="8" w16cid:durableId="94133373">
-    <w:abstractNumId w:val="5"/>
-  </w:num>
-  <w:num w:numId="9" w16cid:durableId="1708598032">
-    <w:abstractNumId w:val="14"/>
-  </w:num>
-  <w:num w:numId="10" w16cid:durableId="608002620">
+  <w:num w:numId="19" w16cid:durableId="877281866">
     <w:abstractNumId w:val="4"/>
   </w:num>
-  <w:num w:numId="11" w16cid:durableId="1246112386">
-    <w:abstractNumId w:val="9"/>
+  <w:num w:numId="20" w16cid:durableId="1571887949">
+    <w:abstractNumId w:val="7"/>
   </w:num>
-  <w:num w:numId="12" w16cid:durableId="88628754">
-    <w:abstractNumId w:val="11"/>
-  </w:num>
-  <w:num w:numId="13" w16cid:durableId="1478110016">
-    <w:abstractNumId w:val="1"/>
-  </w:num>
-  <w:num w:numId="14" w16cid:durableId="1280140075">
-    <w:abstractNumId w:val="12"/>
-  </w:num>
-  <w:num w:numId="15" w16cid:durableId="1216308199">
+  <w:num w:numId="21" w16cid:durableId="552621903">
     <w:abstractNumId w:val="2"/>
-  </w:num>
-  <w:num w:numId="16" w16cid:durableId="987979862">
-    <w:abstractNumId w:val="7"/>
   </w:num>
   <w:numIdMacAtCleanup w:val="16"/>
 </w:numbering>

</xml_diff>